<commit_message>
feat: preparar despliegue cloud en Render con Dockerfile, backend API mobile y configuracion de produccion
</commit_message>
<xml_diff>
--- a/entregables_senati/Cuaderno_Informe_01_Semana01_RELLENO.docx
+++ b/entregables_senati/Cuaderno_Informe_01_Semana01_RELLENO.docx
@@ -27116,7 +27116,7 @@
               <w:rPr>
                 <w:sz w:val="22"/>
               </w:rPr>
-              <w:t>8</w:t>
+              <w:t>5</w:t>
             </w:r>
           </w:p>
         </w:tc>
@@ -27190,7 +27190,7 @@
               <w:rPr>
                 <w:sz w:val="22"/>
               </w:rPr>
-              <w:t>8</w:t>
+              <w:t>5</w:t>
             </w:r>
           </w:p>
         </w:tc>
@@ -27265,7 +27265,7 @@
               <w:rPr>
                 <w:sz w:val="22"/>
               </w:rPr>
-              <w:t>8</w:t>
+              <w:t>5</w:t>
             </w:r>
           </w:p>
         </w:tc>
@@ -27339,7 +27339,7 @@
               <w:rPr>
                 <w:sz w:val="22"/>
               </w:rPr>
-              <w:t>8</w:t>
+              <w:t>5</w:t>
             </w:r>
           </w:p>
         </w:tc>
@@ -27413,7 +27413,7 @@
               <w:rPr>
                 <w:sz w:val="22"/>
               </w:rPr>
-              <w:t>8</w:t>
+              <w:t>5</w:t>
             </w:r>
           </w:p>
         </w:tc>
@@ -27493,7 +27493,7 @@
               <w:rPr>
                 <w:sz w:val="22"/>
               </w:rPr>
-              <w:t>4</w:t>
+              <w:t>5</w:t>
             </w:r>
           </w:p>
         </w:tc>
@@ -27568,12 +27568,152 @@
               <w:rPr>
                 <w:sz w:val="22"/>
               </w:rPr>
-              <w:t>44</w:t>
+              <w:t>30</w:t>
             </w:r>
           </w:p>
         </w:tc>
       </w:tr>
     </w:tbl>
+    <w:p>
+      <w:pPr>
+        <w:spacing w:line="360" w:lineRule="auto"/>
+        <w:ind w:right="-427"/>
+        <w:rPr>
+          <w:sz w:val="22"/>
+          <w:lang w:val="es-MX"/>
+        </w:rPr>
+      </w:pPr>
+    </w:p>
+    <w:p>
+      <w:pPr>
+        <w:spacing w:line="360" w:lineRule="auto"/>
+        <w:ind w:right="-427"/>
+        <w:rPr>
+          <w:sz w:val="22"/>
+          <w:lang w:val="es-MX"/>
+        </w:rPr>
+      </w:pPr>
+    </w:p>
+    <w:p>
+      <w:pPr>
+        <w:spacing w:line="360" w:lineRule="auto"/>
+        <w:ind w:right="-427"/>
+        <w:rPr>
+          <w:sz w:val="22"/>
+          <w:lang w:val="es-MX"/>
+        </w:rPr>
+      </w:pPr>
+    </w:p>
+    <w:p>
+      <w:pPr>
+        <w:spacing w:line="360" w:lineRule="auto"/>
+        <w:ind w:right="-427"/>
+        <w:rPr>
+          <w:sz w:val="22"/>
+          <w:lang w:val="es-MX"/>
+        </w:rPr>
+      </w:pPr>
+    </w:p>
+    <w:p>
+      <w:pPr>
+        <w:spacing w:line="360" w:lineRule="auto"/>
+        <w:ind w:right="-427"/>
+        <w:rPr>
+          <w:sz w:val="22"/>
+          <w:lang w:val="es-MX"/>
+        </w:rPr>
+      </w:pPr>
+    </w:p>
+    <w:p>
+      <w:pPr>
+        <w:spacing w:line="360" w:lineRule="auto"/>
+        <w:ind w:right="-427"/>
+        <w:rPr>
+          <w:sz w:val="22"/>
+          <w:lang w:val="es-MX"/>
+        </w:rPr>
+      </w:pPr>
+    </w:p>
+    <w:p>
+      <w:pPr>
+        <w:spacing w:line="360" w:lineRule="auto"/>
+        <w:ind w:right="-427"/>
+        <w:rPr>
+          <w:sz w:val="22"/>
+          <w:lang w:val="es-MX"/>
+        </w:rPr>
+      </w:pPr>
+    </w:p>
+    <w:p>
+      <w:pPr>
+        <w:spacing w:line="360" w:lineRule="auto"/>
+        <w:ind w:right="-427"/>
+        <w:rPr>
+          <w:sz w:val="22"/>
+          <w:lang w:val="es-MX"/>
+        </w:rPr>
+      </w:pPr>
+    </w:p>
+    <w:p>
+      <w:pPr>
+        <w:spacing w:line="360" w:lineRule="auto"/>
+        <w:ind w:right="-427"/>
+        <w:rPr>
+          <w:sz w:val="22"/>
+          <w:lang w:val="es-MX"/>
+        </w:rPr>
+      </w:pPr>
+    </w:p>
+    <w:p>
+      <w:pPr>
+        <w:spacing w:line="360" w:lineRule="auto"/>
+        <w:ind w:right="-427"/>
+        <w:rPr>
+          <w:sz w:val="22"/>
+          <w:lang w:val="es-MX"/>
+        </w:rPr>
+      </w:pPr>
+    </w:p>
+    <w:p>
+      <w:pPr>
+        <w:spacing w:line="360" w:lineRule="auto"/>
+        <w:ind w:right="-427"/>
+        <w:rPr>
+          <w:sz w:val="22"/>
+          <w:lang w:val="es-MX"/>
+        </w:rPr>
+      </w:pPr>
+    </w:p>
+    <w:p>
+      <w:pPr>
+        <w:spacing w:line="360" w:lineRule="auto"/>
+        <w:ind w:right="-427"/>
+        <w:rPr>
+          <w:sz w:val="22"/>
+          <w:lang w:val="es-MX"/>
+        </w:rPr>
+      </w:pPr>
+    </w:p>
+    <w:p>
+      <w:pPr>
+        <w:spacing w:line="360" w:lineRule="auto"/>
+        <w:ind w:right="-427"/>
+        <w:rPr>
+          <w:sz w:val="22"/>
+          <w:lang w:val="es-MX"/>
+        </w:rPr>
+      </w:pPr>
+    </w:p>
+    <w:p>
+      <w:pPr>
+        <w:spacing w:line="360" w:lineRule="auto"/>
+        <w:ind w:right="-427"/>
+        <w:rPr>
+          <w:sz w:val="22"/>
+          <w:lang w:val="es-MX"/>
+        </w:rPr>
+      </w:pPr>
+    </w:p>
     <w:p>
       <w:pPr>
         <w:spacing w:line="360" w:lineRule="auto"/>
@@ -27757,7 +27897,7 @@
               <w:rPr>
                 <w:sz w:val="22"/>
               </w:rPr>
-              <w:t>8</w:t>
+              <w:t>5</w:t>
             </w:r>
           </w:p>
         </w:tc>
@@ -27807,9 +27947,42 @@
               <w:rPr>
                 <w:sz w:val="22"/>
               </w:rPr>
-              <w:t>Implementación de la autenticación base con Laravel Sanctum (login/logout) y alineación de rutas /api/auth entre backend y frontend.</w:t>
+              <w:t xml:space="preserve">Implementación de la autenticación base con Laravel Sanctum (login/logout) y alineación de rutas /api/auth entre </w:t>
             </w:r>
-          </w:p>
+            <w:proofErr w:type="spellStart"/>
+            <w:r>
+              <w:rPr>
+                <w:sz w:val="22"/>
+              </w:rPr>
+              <w:t>backend</w:t>
+            </w:r>
+            <w:proofErr w:type="spellEnd"/>
+            <w:r>
+              <w:rPr>
+                <w:sz w:val="22"/>
+              </w:rPr>
+              <w:t xml:space="preserve"> y </w:t>
+            </w:r>
+            <w:proofErr w:type="spellStart"/>
+            <w:r>
+              <w:rPr>
+                <w:sz w:val="22"/>
+              </w:rPr>
+              <w:t>frontend</w:t>
+            </w:r>
+            <w:proofErr w:type="spellEnd"/>
+            <w:r>
+              <w:rPr>
+                <w:sz w:val="22"/>
+              </w:rPr>
+              <w:t>.</w:t>
+            </w:r>
+          </w:p>
+        </w:tc>
+        <w:tc>
+          <w:tcPr>
+            <w:tcW w:w="1590" w:type="dxa"/>
+          </w:tcPr>
           <w:p>
             <w:pPr>
               <w:spacing w:line="360" w:lineRule="auto"/>
@@ -27820,27 +27993,11 @@
                 <w:lang w:val="es-MX"/>
               </w:rPr>
             </w:pPr>
-          </w:p>
-        </w:tc>
-        <w:tc>
-          <w:tcPr>
-            <w:tcW w:w="1590" w:type="dxa"/>
-          </w:tcPr>
-          <w:p>
-            <w:pPr>
-              <w:spacing w:line="360" w:lineRule="auto"/>
-              <w:jc w:val="center"/>
-              <w:rPr>
-                <w:b w:val="0"/>
+            <w:r>
+              <w:rPr>
                 <w:sz w:val="22"/>
-                <w:lang w:val="es-MX"/>
-              </w:rPr>
-            </w:pPr>
-            <w:r>
-              <w:rPr>
-                <w:sz w:val="22"/>
-              </w:rPr>
-              <w:t>8</w:t>
+              </w:rPr>
+              <w:t>5</w:t>
             </w:r>
           </w:p>
         </w:tc>
@@ -27894,36 +28051,26 @@
               <w:t>Conexión frontend–API: almacenamiento del token Bearer, consumo de endpoints con Axios y acceso al dashboard tras el inicio de sesión.</w:t>
             </w:r>
           </w:p>
-          <w:p>
-            <w:pPr>
-              <w:spacing w:line="360" w:lineRule="auto"/>
+        </w:tc>
+        <w:tc>
+          <w:tcPr>
+            <w:tcW w:w="1590" w:type="dxa"/>
+          </w:tcPr>
+          <w:p>
+            <w:pPr>
+              <w:spacing w:line="360" w:lineRule="auto"/>
+              <w:jc w:val="center"/>
               <w:rPr>
                 <w:b w:val="0"/>
                 <w:sz w:val="22"/>
                 <w:lang w:val="es-MX"/>
               </w:rPr>
             </w:pPr>
-          </w:p>
-        </w:tc>
-        <w:tc>
-          <w:tcPr>
-            <w:tcW w:w="1590" w:type="dxa"/>
-          </w:tcPr>
-          <w:p>
-            <w:pPr>
-              <w:spacing w:line="360" w:lineRule="auto"/>
-              <w:jc w:val="center"/>
-              <w:rPr>
-                <w:b w:val="0"/>
+            <w:r>
+              <w:rPr>
                 <w:sz w:val="22"/>
-                <w:lang w:val="es-MX"/>
-              </w:rPr>
-            </w:pPr>
-            <w:r>
-              <w:rPr>
-                <w:sz w:val="22"/>
-              </w:rPr>
-              <w:t>8</w:t>
+              </w:rPr>
+              <w:t>5</w:t>
             </w:r>
           </w:p>
         </w:tc>
@@ -27973,9 +28120,28 @@
               <w:rPr>
                 <w:sz w:val="22"/>
               </w:rPr>
-              <w:t>Desarrollo de las primeras funcionalidades académicas: CRUD de alumnos, docentes, grados y secciones, con sus endpoints y pantallas iniciales.</w:t>
+              <w:t xml:space="preserve">Desarrollo de las primeras funcionalidades académicas: CRUD de alumnos, docentes, grados y secciones, con sus </w:t>
             </w:r>
-          </w:p>
+            <w:proofErr w:type="spellStart"/>
+            <w:r>
+              <w:rPr>
+                <w:sz w:val="22"/>
+              </w:rPr>
+              <w:t>endpoints</w:t>
+            </w:r>
+            <w:proofErr w:type="spellEnd"/>
+            <w:r>
+              <w:rPr>
+                <w:sz w:val="22"/>
+              </w:rPr>
+              <w:t xml:space="preserve"> y pantallas iniciales.</w:t>
+            </w:r>
+          </w:p>
+        </w:tc>
+        <w:tc>
+          <w:tcPr>
+            <w:tcW w:w="1590" w:type="dxa"/>
+          </w:tcPr>
           <w:p>
             <w:pPr>
               <w:spacing w:line="360" w:lineRule="auto"/>
@@ -27986,27 +28152,11 @@
                 <w:lang w:val="es-MX"/>
               </w:rPr>
             </w:pPr>
-          </w:p>
-        </w:tc>
-        <w:tc>
-          <w:tcPr>
-            <w:tcW w:w="1590" w:type="dxa"/>
-          </w:tcPr>
-          <w:p>
-            <w:pPr>
-              <w:spacing w:line="360" w:lineRule="auto"/>
-              <w:jc w:val="center"/>
-              <w:rPr>
-                <w:b w:val="0"/>
+            <w:r>
+              <w:rPr>
                 <w:sz w:val="22"/>
-                <w:lang w:val="es-MX"/>
-              </w:rPr>
-            </w:pPr>
-            <w:r>
-              <w:rPr>
-                <w:sz w:val="22"/>
-              </w:rPr>
-              <w:t>8</w:t>
+              </w:rPr>
+              <w:t>5</w:t>
             </w:r>
           </w:p>
         </w:tc>
@@ -28056,9 +28206,28 @@
               <w:rPr>
                 <w:sz w:val="22"/>
               </w:rPr>
-              <w:t>Pruebas funcionales de autenticación y CRUD básicos; corrección de desalineaciones detectadas entre frontend y backend en el módulo de auth.</w:t>
+              <w:t xml:space="preserve">Pruebas funcionales de autenticación y CRUD básicos; corrección de desalineaciones detectadas entre frontend y backend en el módulo de </w:t>
             </w:r>
-          </w:p>
+            <w:proofErr w:type="spellStart"/>
+            <w:r>
+              <w:rPr>
+                <w:sz w:val="22"/>
+              </w:rPr>
+              <w:t>auth</w:t>
+            </w:r>
+            <w:proofErr w:type="spellEnd"/>
+            <w:r>
+              <w:rPr>
+                <w:sz w:val="22"/>
+              </w:rPr>
+              <w:t>.</w:t>
+            </w:r>
+          </w:p>
+        </w:tc>
+        <w:tc>
+          <w:tcPr>
+            <w:tcW w:w="1590" w:type="dxa"/>
+          </w:tcPr>
           <w:p>
             <w:pPr>
               <w:spacing w:line="360" w:lineRule="auto"/>
@@ -28069,27 +28238,11 @@
                 <w:lang w:val="es-MX"/>
               </w:rPr>
             </w:pPr>
-          </w:p>
-        </w:tc>
-        <w:tc>
-          <w:tcPr>
-            <w:tcW w:w="1590" w:type="dxa"/>
-          </w:tcPr>
-          <w:p>
-            <w:pPr>
-              <w:spacing w:line="360" w:lineRule="auto"/>
-              <w:jc w:val="center"/>
-              <w:rPr>
-                <w:b w:val="0"/>
+            <w:r>
+              <w:rPr>
                 <w:sz w:val="22"/>
-                <w:lang w:val="es-MX"/>
-              </w:rPr>
-            </w:pPr>
-            <w:r>
-              <w:rPr>
-                <w:sz w:val="22"/>
-              </w:rPr>
-              <w:t>8</w:t>
+              </w:rPr>
+              <w:t>5</w:t>
             </w:r>
           </w:p>
         </w:tc>
@@ -28148,6 +28301,11 @@
               <w:t>Documentación del arranque local (README) y consolidación del entorno para continuar el desarrollo de los módulos restantes del sistema.</w:t>
             </w:r>
           </w:p>
+        </w:tc>
+        <w:tc>
+          <w:tcPr>
+            <w:tcW w:w="1590" w:type="dxa"/>
+          </w:tcPr>
           <w:p>
             <w:pPr>
               <w:spacing w:line="360" w:lineRule="auto"/>
@@ -28158,27 +28316,11 @@
                 <w:lang w:val="es-MX"/>
               </w:rPr>
             </w:pPr>
-          </w:p>
-        </w:tc>
-        <w:tc>
-          <w:tcPr>
-            <w:tcW w:w="1590" w:type="dxa"/>
-          </w:tcPr>
-          <w:p>
-            <w:pPr>
-              <w:spacing w:line="360" w:lineRule="auto"/>
-              <w:jc w:val="center"/>
-              <w:rPr>
-                <w:b w:val="0"/>
+            <w:r>
+              <w:rPr>
                 <w:sz w:val="22"/>
-                <w:lang w:val="es-MX"/>
-              </w:rPr>
-            </w:pPr>
-            <w:r>
-              <w:rPr>
-                <w:sz w:val="22"/>
-              </w:rPr>
-              <w:t>4</w:t>
+              </w:rPr>
+              <w:t>5</w:t>
             </w:r>
           </w:p>
         </w:tc>
@@ -28264,12 +28406,147 @@
               <w:rPr>
                 <w:sz w:val="22"/>
               </w:rPr>
-              <w:t>44</w:t>
+              <w:t>30</w:t>
             </w:r>
           </w:p>
         </w:tc>
       </w:tr>
     </w:tbl>
+    <w:p>
+      <w:pPr>
+        <w:jc w:val="center"/>
+        <w:rPr>
+          <w:sz w:val="24"/>
+          <w:lang w:val="es-MX"/>
+        </w:rPr>
+      </w:pPr>
+    </w:p>
+    <w:p>
+      <w:pPr>
+        <w:jc w:val="center"/>
+        <w:rPr>
+          <w:sz w:val="24"/>
+          <w:lang w:val="es-MX"/>
+        </w:rPr>
+      </w:pPr>
+    </w:p>
+    <w:p>
+      <w:pPr>
+        <w:jc w:val="center"/>
+        <w:rPr>
+          <w:sz w:val="24"/>
+          <w:lang w:val="es-MX"/>
+        </w:rPr>
+      </w:pPr>
+    </w:p>
+    <w:p>
+      <w:pPr>
+        <w:jc w:val="center"/>
+        <w:rPr>
+          <w:sz w:val="24"/>
+          <w:lang w:val="es-MX"/>
+        </w:rPr>
+      </w:pPr>
+    </w:p>
+    <w:p>
+      <w:pPr>
+        <w:jc w:val="center"/>
+        <w:rPr>
+          <w:sz w:val="24"/>
+          <w:lang w:val="es-MX"/>
+        </w:rPr>
+      </w:pPr>
+    </w:p>
+    <w:p>
+      <w:pPr>
+        <w:jc w:val="center"/>
+        <w:rPr>
+          <w:sz w:val="24"/>
+          <w:lang w:val="es-MX"/>
+        </w:rPr>
+      </w:pPr>
+    </w:p>
+    <w:p>
+      <w:pPr>
+        <w:jc w:val="center"/>
+        <w:rPr>
+          <w:sz w:val="24"/>
+          <w:lang w:val="es-MX"/>
+        </w:rPr>
+      </w:pPr>
+    </w:p>
+    <w:p>
+      <w:pPr>
+        <w:jc w:val="center"/>
+        <w:rPr>
+          <w:sz w:val="24"/>
+          <w:lang w:val="es-MX"/>
+        </w:rPr>
+      </w:pPr>
+    </w:p>
+    <w:p>
+      <w:pPr>
+        <w:jc w:val="center"/>
+        <w:rPr>
+          <w:sz w:val="24"/>
+          <w:lang w:val="es-MX"/>
+        </w:rPr>
+      </w:pPr>
+    </w:p>
+    <w:p>
+      <w:pPr>
+        <w:jc w:val="center"/>
+        <w:rPr>
+          <w:sz w:val="24"/>
+          <w:lang w:val="es-MX"/>
+        </w:rPr>
+      </w:pPr>
+    </w:p>
+    <w:p>
+      <w:pPr>
+        <w:jc w:val="center"/>
+        <w:rPr>
+          <w:sz w:val="24"/>
+          <w:lang w:val="es-MX"/>
+        </w:rPr>
+      </w:pPr>
+    </w:p>
+    <w:p>
+      <w:pPr>
+        <w:jc w:val="center"/>
+        <w:rPr>
+          <w:sz w:val="24"/>
+          <w:lang w:val="es-MX"/>
+        </w:rPr>
+      </w:pPr>
+    </w:p>
+    <w:p>
+      <w:pPr>
+        <w:jc w:val="center"/>
+        <w:rPr>
+          <w:sz w:val="24"/>
+          <w:lang w:val="es-MX"/>
+        </w:rPr>
+      </w:pPr>
+    </w:p>
+    <w:p>
+      <w:pPr>
+        <w:jc w:val="center"/>
+        <w:rPr>
+          <w:sz w:val="24"/>
+          <w:lang w:val="es-MX"/>
+        </w:rPr>
+      </w:pPr>
+    </w:p>
+    <w:p>
+      <w:pPr>
+        <w:jc w:val="center"/>
+        <w:rPr>
+          <w:sz w:val="24"/>
+          <w:lang w:val="es-MX"/>
+        </w:rPr>
+      </w:pPr>
+    </w:p>
     <w:p>
       <w:pPr>
         <w:jc w:val="center"/>
@@ -28316,6 +28593,7 @@
           <w:szCs w:val="32"/>
           <w:lang w:val="es-MX"/>
         </w:rPr>
+        <w:lastRenderedPageBreak/>
         <w:t>INFORME DE FORMACIÓN PRÁCTICA EN EMPRESA</w:t>
       </w:r>
     </w:p>
@@ -28349,30 +28627,6 @@
           <w:lang w:val="es-MX"/>
         </w:rPr>
         <w:t>Tarea más significativa durante las dos semanas: ¿Por qué eligió esta tarea y qué operaciones del PEA cumplió con su ejecución?</w:t>
-      </w:r>
-      <w:r>
-        <w:rPr>
-          <w:b w:val="0"/>
-          <w:sz w:val="22"/>
-          <w:lang w:val="es-MX"/>
-        </w:rPr>
-        <w:tab/>
-      </w:r>
-      <w:r>
-        <w:rPr>
-          <w:b w:val="0"/>
-          <w:sz w:val="22"/>
-          <w:lang w:val="es-MX"/>
-        </w:rPr>
-        <w:tab/>
-      </w:r>
-      <w:r>
-        <w:rPr>
-          <w:b w:val="0"/>
-          <w:sz w:val="22"/>
-          <w:lang w:val="es-MX"/>
-        </w:rPr>
-        <w:tab/>
       </w:r>
     </w:p>
     <w:p>
@@ -28704,35 +28958,6 @@
         </w:rPr>
         <w:t xml:space="preserve">10. Se realizaron pruebas funcionales, se corrigieron desalineaciones de auth y se documentó el arranque. </w:t>
       </w:r>
-      <w:r>
-        <w:rPr>
-          <w:b w:val="0"/>
-          <w:sz w:val="22"/>
-          <w:lang w:val="es-MX"/>
-        </w:rPr>
-        <w:tab/>
-      </w:r>
-    </w:p>
-    <w:p>
-      <w:pPr>
-        <w:tabs>
-          <w:tab w:val="left" w:leader="underscore" w:pos="9700"/>
-        </w:tabs>
-        <w:spacing w:line="360" w:lineRule="auto"/>
-        <w:rPr>
-          <w:b w:val="0"/>
-          <w:sz w:val="22"/>
-          <w:lang w:val="es-MX"/>
-        </w:rPr>
-      </w:pPr>
-      <w:r>
-        <w:rPr>
-          <w:b w:val="0"/>
-          <w:sz w:val="22"/>
-          <w:lang w:val="es-MX"/>
-        </w:rPr>
-        <w:tab/>
-      </w:r>
     </w:p>
     <w:p>
       <w:pPr>
@@ -28813,38 +29038,19 @@
         </w:rPr>
         <w:t xml:space="preserve">Visual Studio Code (editor), Git y GitHub (control de versiones del repositorio SistemaEscolar). </w:t>
       </w:r>
-      <w:r>
+    </w:p>
+    <w:p>
+      <w:pPr>
+        <w:tabs>
+          <w:tab w:val="left" w:leader="underscore" w:pos="9700"/>
+        </w:tabs>
+        <w:spacing w:line="360" w:lineRule="auto"/>
         <w:rPr>
           <w:b w:val="0"/>
           <w:sz w:val="22"/>
           <w:lang w:val="es-MX"/>
         </w:rPr>
-        <w:tab/>
-        <w:tab/>
-        <w:tab/>
-        <w:tab/>
-      </w:r>
-      <w:r>
-        <w:rPr>
-          <w:b w:val="0"/>
-          <w:sz w:val="22"/>
-          <w:lang w:val="es-MX"/>
-        </w:rPr>
-      </w:r>
-      <w:r>
-        <w:rPr>
-          <w:b w:val="0"/>
-          <w:sz w:val="22"/>
-          <w:lang w:val="es-MX"/>
-        </w:rPr>
-      </w:r>
-      <w:r>
-        <w:rPr>
-          <w:b w:val="0"/>
-          <w:sz w:val="22"/>
-          <w:lang w:val="es-MX"/>
-        </w:rPr>
-      </w:r>
+      </w:pPr>
     </w:p>
     <w:p>
       <w:pPr>
@@ -28883,30 +29089,6 @@
         </w:rPr>
         <w:tab/>
       </w:r>
-      <w:r>
-        <w:rPr>
-          <w:b w:val="0"/>
-          <w:sz w:val="22"/>
-          <w:lang w:val="es-MX"/>
-        </w:rPr>
-        <w:tab/>
-      </w:r>
-      <w:r>
-        <w:rPr>
-          <w:b w:val="0"/>
-          <w:sz w:val="22"/>
-          <w:lang w:val="es-MX"/>
-        </w:rPr>
-        <w:tab/>
-      </w:r>
-      <w:r>
-        <w:rPr>
-          <w:b w:val="0"/>
-          <w:sz w:val="22"/>
-          <w:lang w:val="es-MX"/>
-        </w:rPr>
-        <w:tab/>
-      </w:r>
     </w:p>
     <w:p>
       <w:pPr>
@@ -28940,14 +29122,6 @@
       <w:r>
         <w:rPr>
           <w:bCs w:val="0"/>
-          <w:sz w:val="22"/>
-          <w:lang w:val="es-MX"/>
-        </w:rPr>
-        <w:tab/>
-      </w:r>
-      <w:r>
-        <w:rPr>
-          <w:b w:val="0"/>
           <w:sz w:val="22"/>
           <w:lang w:val="es-MX"/>
         </w:rPr>
@@ -29159,6 +29333,7 @@
                 <w:rFonts w:ascii="Arial" w:hAnsi="Arial" w:cs="Arial"/>
                 <w:lang w:val="es-MX"/>
               </w:rPr>
+              <w:lastRenderedPageBreak/>
               <w:t>HACER ESQUEMA, DIBUJO O DIAGRAMA</w:t>
             </w:r>
           </w:p>
@@ -29166,23 +29341,67 @@
             <w:pPr>
               <w:jc w:val="center"/>
             </w:pPr>
+          </w:p>
+        </w:tc>
+      </w:tr>
+      <w:tr>
+        <w:trPr>
+          <w:trHeight w:val="7109"/>
+        </w:trPr>
+        <w:tc>
+          <w:tcPr>
+            <w:tcW w:w="10176" w:type="dxa"/>
+            <w:tcBorders>
+              <w:top w:val="single" w:sz="4" w:space="0" w:color="auto"/>
+              <w:left w:val="single" w:sz="4" w:space="0" w:color="auto"/>
+              <w:right w:val="single" w:sz="4" w:space="0" w:color="auto"/>
+            </w:tcBorders>
+            <w:shd w:val="pct85" w:color="FFFFFF" w:fill="auto"/>
+          </w:tcPr>
+          <w:p>
+            <w:pPr>
+              <w:spacing w:line="120" w:lineRule="auto"/>
+              <w:rPr>
+                <w:b w:val="0"/>
+                <w:sz w:val="22"/>
+                <w:lang w:val="es-MX"/>
+              </w:rPr>
+            </w:pPr>
             <w:r>
+              <w:rPr>
+                <w:noProof/>
+              </w:rPr>
               <w:drawing>
-                <wp:inline xmlns:a="http://schemas.openxmlformats.org/drawingml/2006/main" xmlns:pic="http://schemas.openxmlformats.org/drawingml/2006/picture">
-                  <wp:extent cx="5472000" cy="7213091"/>
+                <wp:anchor distT="0" distB="0" distL="114300" distR="114300" simplePos="0" relativeHeight="251675648" behindDoc="0" locked="0" layoutInCell="1" allowOverlap="1" wp14:anchorId="3E44A7EF" wp14:editId="6A4D2FBE">
+                  <wp:simplePos x="0" y="0"/>
+                  <wp:positionH relativeFrom="column">
+                    <wp:posOffset>1541145</wp:posOffset>
+                  </wp:positionH>
+                  <wp:positionV relativeFrom="paragraph">
+                    <wp:posOffset>142240</wp:posOffset>
+                  </wp:positionV>
+                  <wp:extent cx="3093720" cy="4077714"/>
+                  <wp:effectExtent l="0" t="0" r="0" b="0"/>
+                  <wp:wrapNone/>
                   <wp:docPr id="1123435822" name="Picture 1123435822"/>
                   <wp:cNvGraphicFramePr>
-                    <a:graphicFrameLocks noChangeAspect="1"/>
+                    <a:graphicFrameLocks xmlns:a="http://schemas.openxmlformats.org/drawingml/2006/main" noChangeAspect="1"/>
                   </wp:cNvGraphicFramePr>
-                  <a:graphic>
+                  <a:graphic xmlns:a="http://schemas.openxmlformats.org/drawingml/2006/main">
                     <a:graphicData uri="http://schemas.openxmlformats.org/drawingml/2006/picture">
-                      <pic:pic>
+                      <pic:pic xmlns:pic="http://schemas.openxmlformats.org/drawingml/2006/picture">
                         <pic:nvPicPr>
                           <pic:cNvPr id="0" name="03_Diagrama_Arquitectura_Inicial.png"/>
                           <pic:cNvPicPr/>
                         </pic:nvPicPr>
                         <pic:blipFill>
-                          <a:blip r:embed="rId18"/>
+                          <a:blip r:embed="rId11" cstate="print">
+                            <a:extLst>
+                              <a:ext uri="{28A0092B-C50C-407E-A947-70E740481C1C}">
+                                <a14:useLocalDpi xmlns:a14="http://schemas.microsoft.com/office/drawing/2010/main" val="0"/>
+                              </a:ext>
+                            </a:extLst>
+                          </a:blip>
                           <a:stretch>
                             <a:fillRect/>
                           </a:stretch>
@@ -29190,42 +29409,24 @@
                         <pic:spPr>
                           <a:xfrm>
                             <a:off x="0" y="0"/>
-                            <a:ext cx="5472000" cy="7213091"/>
+                            <a:ext cx="3093720" cy="4077714"/>
                           </a:xfrm>
-                          <a:prstGeom prst="rect"/>
+                          <a:prstGeom prst="rect">
+                            <a:avLst/>
+                          </a:prstGeom>
                         </pic:spPr>
                       </pic:pic>
                     </a:graphicData>
                   </a:graphic>
-                </wp:inline>
+                  <wp14:sizeRelH relativeFrom="margin">
+                    <wp14:pctWidth>0</wp14:pctWidth>
+                  </wp14:sizeRelH>
+                  <wp14:sizeRelV relativeFrom="margin">
+                    <wp14:pctHeight>0</wp14:pctHeight>
+                  </wp14:sizeRelV>
+                </wp:anchor>
               </w:drawing>
             </w:r>
-          </w:p>
-        </w:tc>
-      </w:tr>
-      <w:tr>
-        <w:trPr>
-          <w:trHeight w:val="7109"/>
-        </w:trPr>
-        <w:tc>
-          <w:tcPr>
-            <w:tcW w:w="10176" w:type="dxa"/>
-            <w:tcBorders>
-              <w:top w:val="single" w:sz="4" w:space="0" w:color="auto"/>
-              <w:left w:val="single" w:sz="4" w:space="0" w:color="auto"/>
-              <w:right w:val="single" w:sz="4" w:space="0" w:color="auto"/>
-            </w:tcBorders>
-            <w:shd w:val="pct85" w:color="FFFFFF" w:fill="auto"/>
-          </w:tcPr>
-          <w:p>
-            <w:pPr>
-              <w:spacing w:line="120" w:lineRule="auto"/>
-              <w:rPr>
-                <w:b w:val="0"/>
-                <w:sz w:val="22"/>
-                <w:lang w:val="es-MX"/>
-              </w:rPr>
-            </w:pPr>
           </w:p>
         </w:tc>
       </w:tr>
@@ -29435,7 +29636,7 @@
     <w:p>
       <w:pPr>
         <w:sectPr>
-          <w:headerReference w:type="default" r:id="rId11"/>
+          <w:headerReference w:type="default" r:id="rId12"/>
           <w:pgSz w:w="11906" w:h="16838"/>
           <w:pgMar w:top="1418" w:right="1134" w:bottom="1418" w:left="1418" w:header="709" w:footer="709" w:gutter="0"/>
           <w:cols w:space="708"/>
@@ -29505,11 +29706,11 @@
                     </pic:cNvPicPr>
                   </pic:nvPicPr>
                   <pic:blipFill>
-                    <a:blip r:embed="rId12">
+                    <a:blip r:embed="rId13">
                       <a:extLst>
                         <a:ext uri="{BEBA8EAE-BF5A-486C-A8C5-ECC9F3942E4B}">
                           <a14:imgProps xmlns:a14="http://schemas.microsoft.com/office/drawing/2010/main">
-                            <a14:imgLayer r:embed="rId13">
+                            <a14:imgLayer r:embed="rId14">
                               <a14:imgEffect>
                                 <a14:sharpenSoften amount="25000"/>
                               </a14:imgEffect>
@@ -29709,8 +29910,8 @@
     </w:p>
     <w:p/>
     <w:sectPr>
-      <w:headerReference w:type="default" r:id="rId14"/>
-      <w:footerReference w:type="default" r:id="rId15"/>
+      <w:headerReference w:type="default" r:id="rId15"/>
+      <w:footerReference w:type="default" r:id="rId16"/>
       <w:pgSz w:w="11906" w:h="16838"/>
       <w:pgMar w:top="1418" w:right="1134" w:bottom="1418" w:left="1418" w:header="709" w:footer="709" w:gutter="0"/>
       <w:cols w:space="708"/>
@@ -31657,19 +31858,6 @@
 </file>
 
 <file path=customXml/item2.xml><?xml version="1.0" encoding="utf-8"?>
-<?mso-contentType ?>
-<FormTemplates xmlns="http://schemas.microsoft.com/sharepoint/v3/contenttype/forms">
-  <Display>DocumentLibraryForm</Display>
-  <Edit>DocumentLibraryForm</Edit>
-  <New>DocumentLibraryForm</New>
-</FormTemplates>
-</file>
-
-<file path=customXml/item3.xml><?xml version="1.0" encoding="utf-8"?>
-<b:Sources xmlns:b="http://schemas.openxmlformats.org/officeDocument/2006/bibliography" xmlns="http://schemas.openxmlformats.org/officeDocument/2006/bibliography" SelectedStyle="\APASixthEditionOfficeOnline.xsl" StyleName="APA" Version="6"/>
-</file>
-
-<file path=customXml/item4.xml><?xml version="1.0" encoding="utf-8"?>
 <ct:contentTypeSchema xmlns:ct="http://schemas.microsoft.com/office/2006/metadata/contentType" xmlns:ma="http://schemas.microsoft.com/office/2006/metadata/properties/metaAttributes" ct:_="" ma:_="" ma:contentTypeName="Document" ma:contentTypeID="0x010100795EFC9A07ECD140851F1B2ABF131888" ma:contentTypeVersion="42" ma:contentTypeDescription="Create a new document." ma:contentTypeScope="" ma:versionID="68705ce6714181f4c3a7778789206999">
   <xsd:schema xmlns:xsd="http://www.w3.org/2001/XMLSchema" xmlns:xs="http://www.w3.org/2001/XMLSchema" xmlns:p="http://schemas.microsoft.com/office/2006/metadata/properties" xmlns:ns2="8b0498ea-4bc6-4676-a87b-9cffe7f59fc7" xmlns:ns3="ee27a0f9-7ff9-4c05-b61a-f7053cc3ff56" targetNamespace="http://schemas.microsoft.com/office/2006/metadata/properties" ma:root="true" ma:fieldsID="837849ccf018e896f9c9e07cfaff02ef" ns2:_="" ns3:_="">
     <xsd:import namespace="8b0498ea-4bc6-4676-a87b-9cffe7f59fc7"/>
@@ -31965,6 +32153,19 @@
 </ct:contentTypeSchema>
 </file>
 
+<file path=customXml/item3.xml><?xml version="1.0" encoding="utf-8"?>
+<b:Sources xmlns:b="http://schemas.openxmlformats.org/officeDocument/2006/bibliography" xmlns="http://schemas.openxmlformats.org/officeDocument/2006/bibliography" SelectedStyle="\APASixthEditionOfficeOnline.xsl" StyleName="APA" Version="6"/>
+</file>
+
+<file path=customXml/item4.xml><?xml version="1.0" encoding="utf-8"?>
+<?mso-contentType ?>
+<FormTemplates xmlns="http://schemas.microsoft.com/sharepoint/v3/contenttype/forms">
+  <Display>DocumentLibraryForm</Display>
+  <Edit>DocumentLibraryForm</Edit>
+  <New>DocumentLibraryForm</New>
+</FormTemplates>
+</file>
+
 <file path=customXml/itemProps1.xml><?xml version="1.0" encoding="utf-8"?>
 <ds:datastoreItem xmlns:ds="http://schemas.openxmlformats.org/officeDocument/2006/customXml" ds:itemID="{8B365F48-C2B5-4E3D-BA44-D9D74DBA7350}">
   <ds:schemaRefs>
@@ -31977,22 +32178,6 @@
 </file>
 
 <file path=customXml/itemProps2.xml><?xml version="1.0" encoding="utf-8"?>
-<ds:datastoreItem xmlns:ds="http://schemas.openxmlformats.org/officeDocument/2006/customXml" ds:itemID="{21DA1112-85AB-4ED2-BDE2-25A2490B57E1}">
-  <ds:schemaRefs>
-    <ds:schemaRef ds:uri="http://schemas.microsoft.com/sharepoint/v3/contenttype/forms"/>
-  </ds:schemaRefs>
-</ds:datastoreItem>
-</file>
-
-<file path=customXml/itemProps3.xml><?xml version="1.0" encoding="utf-8"?>
-<ds:datastoreItem xmlns:ds="http://schemas.openxmlformats.org/officeDocument/2006/customXml" ds:itemID="{455BB17B-E27A-4214-83F0-7FBA8236E2E5}">
-  <ds:schemaRefs>
-    <ds:schemaRef ds:uri="http://schemas.openxmlformats.org/officeDocument/2006/bibliography"/>
-  </ds:schemaRefs>
-</ds:datastoreItem>
-</file>
-
-<file path=customXml/itemProps4.xml><?xml version="1.0" encoding="utf-8"?>
 <ds:datastoreItem xmlns:ds="http://schemas.openxmlformats.org/officeDocument/2006/customXml" ds:itemID="{5BD17F61-6494-47EC-8221-5B5110D1E1FC}">
   <ds:schemaRefs>
     <ds:schemaRef ds:uri="http://schemas.microsoft.com/office/2006/metadata/contentType"/>
@@ -32009,4 +32194,20 @@
     <ds:schemaRef ds:uri="http://schemas.microsoft.com/internal/obd"/>
   </ds:schemaRefs>
 </ds:datastoreItem>
+</file>
+
+<file path=customXml/itemProps3.xml><?xml version="1.0" encoding="utf-8"?>
+<ds:datastoreItem xmlns:ds="http://schemas.openxmlformats.org/officeDocument/2006/customXml" ds:itemID="{455BB17B-E27A-4214-83F0-7FBA8236E2E5}">
+  <ds:schemaRefs>
+    <ds:schemaRef ds:uri="http://schemas.openxmlformats.org/officeDocument/2006/bibliography"/>
+  </ds:schemaRefs>
+</ds:datastoreItem>
+</file>
+
+<file path=customXml/itemProps4.xml><?xml version="1.0" encoding="utf-8"?>
+<ds:datastoreItem xmlns:ds="http://schemas.openxmlformats.org/officeDocument/2006/customXml" ds:itemID="{21DA1112-85AB-4ED2-BDE2-25A2490B57E1}">
+  <ds:schemaRefs>
+    <ds:schemaRef ds:uri="http://schemas.microsoft.com/sharepoint/v3/contenttype/forms"/>
+  </ds:schemaRefs>
+</ds:datastoreItem>
 </file>
</xml_diff>